<commit_message>
Modelo de acceso por consultor + firma de consultora en Word
- Auth: el consultor crea accesos (correo + código de acceso random) desde
  /consultor/usuarios; el establecimiento solo inicia sesión. Se quita el
  registro propio (signup). Login pide "código de acceso".
- Word (MSE-FO-55): la firma de la consultora se embebe (imagen) al aprobar,
  vía docxtemplater-image-module-free.

Co-Authored-By: Claude Opus 4.8 <noreply@anthropic.com>
</commit_message>
<xml_diff>
--- a/templates/verificacion.docx
+++ b/templates/verificacion.docx
@@ -1374,7 +1374,46 @@
         </w:rPr>
         <w:t>Firma Ejecutivo de la empresa ________________</w:t>
         <w:tab/>
-        <w:t>Firma Consultor {evaluador}</w:t>
+        <w:t>Firma Consultor</w:t>
+      </w:r>
+    </w:p>
+    <w:p>
+      <w:pPr>
+        <w:jc w:val="both"/>
+        <w:rPr>
+          <w:rFonts w:ascii="Soberana Sans Light" w:hAnsi="Soberana Sans Light" w:cs="Arial"/>
+          <w:sz w:val="18"/>
+          <w:lang w:val="es-ES"/>
+        </w:rPr>
+      </w:pPr>
+      <w:r>
+        <w:t xml:space="preserve">{#firmaConsultor}</w:t>
+      </w:r>
+    </w:p>
+    <w:p>
+      <w:pPr>
+        <w:jc w:val="both"/>
+        <w:rPr>
+          <w:rFonts w:ascii="Soberana Sans Light" w:hAnsi="Soberana Sans Light" w:cs="Arial"/>
+          <w:sz w:val="18"/>
+          <w:lang w:val="es-ES"/>
+        </w:rPr>
+      </w:pPr>
+      <w:r>
+        <w:t xml:space="preserve">{%firma_img}</w:t>
+      </w:r>
+    </w:p>
+    <w:p>
+      <w:pPr>
+        <w:jc w:val="both"/>
+        <w:rPr>
+          <w:rFonts w:ascii="Soberana Sans Light" w:hAnsi="Soberana Sans Light" w:cs="Arial"/>
+          <w:sz w:val="18"/>
+          <w:lang w:val="es-ES"/>
+        </w:rPr>
+      </w:pPr>
+      <w:r>
+        <w:t xml:space="preserve">{/firmaConsultor}</w:t>
       </w:r>
     </w:p>
     <w:p>

</xml_diff>